<commit_message>
Sync user manual + cheatsheet with new CMS sidebar names
After the sidebar reorganisation (group prefixes 'Page · X', 'Story · X',
'Work · X', 'Shop · X' etc.) the manual still pointed Anna to the old
labels (e.g. 'Content Manager -> Articles'). Updated every path-pointer
in both .md and .docx versions:

  Articles            -> Story · Article
  Article Categories  -> Story · Category
  Products            -> Shop · Product
  Orders              -> Shop · Order
  Programmes          -> Work · Programme
  Coaching Sessions   -> Work · Coaching Session
  The Work section    -> Work with Anna section

Replaced the 'Where things live in Content Manager' overview (section 1)
with a tour of the new grouped layout including the 'zz · (unused)'
bottom group note. Added an explainer in section 4 (About page)
about press_logos and certifications now being form-editable
repeatable components with image upload per row.
</commit_message>
<xml_diff>
--- a/Docs/ANNA_QUICK_REFERENCE.docx
+++ b/Docs/ANNA_QUICK_REFERENCE.docx
@@ -89,7 +89,7 @@
           <w:color w:val="231F20"/>
           <w:sz w:val="22"/>
         </w:rPr>
-        <w:t>Articles</w:t>
+        <w:t>Story · Article</w:t>
       </w:r>
       <w:r>
         <w:rPr>
@@ -219,7 +219,7 @@
           <w:color w:val="231F20"/>
           <w:sz w:val="22"/>
         </w:rPr>
-        <w:t>Articles</w:t>
+        <w:t>Story · Article</w:t>
       </w:r>
       <w:r>
         <w:rPr>
@@ -305,7 +305,7 @@
           <w:color w:val="231F20"/>
           <w:sz w:val="22"/>
         </w:rPr>
-        <w:t>Products</w:t>
+        <w:t>Shop · Product</w:t>
       </w:r>
       <w:r>
         <w:rPr>
@@ -396,7 +396,7 @@
           <w:color w:val="231F20"/>
           <w:sz w:val="22"/>
         </w:rPr>
-        <w:t>Orders</w:t>
+        <w:t>Shop · Order</w:t>
       </w:r>
       <w:r>
         <w:rPr>
@@ -961,7 +961,7 @@
           <w:color w:val="231F20"/>
           <w:sz w:val="22"/>
         </w:rPr>
-        <w:t>Programmes</w:t>
+        <w:t>Work · Programme</w:t>
       </w:r>
       <w:r>
         <w:rPr>

</xml_diff>